<commit_message>
docs: add git workflow section and changelog to dev guide
- Section 8: git push commands, commit format, excluded files list
- Changelog updated with GitHub push milestone
- Fixed .gitignore: /lib/ instead of lib/ (was blocking frontend/src/lib/)
- Added .gitattributes for LF line ending enforcement
</commit_message>
<xml_diff>
--- a/DEVELOPMENT_GUIDE.docx
+++ b/DEVELOPMENT_GUIDE.docx
@@ -23,7 +23,7 @@
           <w:color w:val="6B7280"/>
           <w:sz w:val="18"/>
         </w:rPr>
-        <w:t>Last updated: 2026-05-25 09:44</w:t>
+        <w:t>Last updated: 2026-05-25 09:55</w:t>
       </w:r>
     </w:p>
     <w:p/>
@@ -1093,7 +1093,292 @@
         <w:rPr>
           <w:color w:val="1A56DB"/>
         </w:rPr>
-        <w:t>8. Change Log</w:t>
+        <w:t>8. Git Workflow</w:t>
+      </w:r>
+    </w:p>
+    <w:p>
+      <w:r>
+        <w:t>The repository is hosted at: https://github.com/ahamedshaik52/My-Avatar</w:t>
+      </w:r>
+    </w:p>
+    <w:p>
+      <w:pPr>
+        <w:pStyle w:val="Heading2"/>
+      </w:pPr>
+      <w:r>
+        <w:rPr>
+          <w:color w:val="37516F"/>
+        </w:rPr>
+        <w:t>8.1  Pushing changes after editing files</w:t>
+      </w:r>
+    </w:p>
+    <w:p>
+      <w:r>
+        <w:t>After making any code changes, run these commands:</w:t>
+      </w:r>
+    </w:p>
+    <w:p>
+      <w:pPr>
+        <w:spacing w:before="80" w:after="80"/>
+        <w:ind w:left="432"/>
+        <w:shd w:val="clear" w:color="auto" w:fill="F3F4F6"/>
+      </w:pPr>
+      <w:r>
+        <w:rPr>
+          <w:rFonts w:ascii="Courier New" w:hAnsi="Courier New"/>
+          <w:color w:val="1F2937"/>
+          <w:sz w:val="18"/>
+        </w:rPr>
+        <w:t>cd C:\Users\ahame\my-avatar</w:t>
+        <w:br/>
+        <w:br/>
+        <w:t># Stage the files you changed (replace with actual file paths)</w:t>
+        <w:br/>
+        <w:t>git add &lt;file-or-folder&gt;</w:t>
+        <w:br/>
+        <w:br/>
+        <w:t># Or stage everything (respects .gitignore automatically)</w:t>
+        <w:br/>
+        <w:t>git add .</w:t>
+        <w:br/>
+        <w:br/>
+        <w:t># Commit with a descriptive message</w:t>
+        <w:br/>
+        <w:t>git commit -m "feat: describe what you changed"</w:t>
+        <w:br/>
+        <w:br/>
+        <w:t># Push to GitHub</w:t>
+        <w:br/>
+        <w:t>git push</w:t>
+      </w:r>
+    </w:p>
+    <w:p>
+      <w:pPr>
+        <w:pStyle w:val="Heading2"/>
+      </w:pPr>
+      <w:r>
+        <w:rPr>
+          <w:color w:val="37516F"/>
+        </w:rPr>
+        <w:t>8.2  Commit message format</w:t>
+      </w:r>
+    </w:p>
+    <w:p>
+      <w:r>
+        <w:t>Follow these prefixes for clear history:</w:t>
+      </w:r>
+    </w:p>
+    <w:p>
+      <w:pPr>
+        <w:pStyle w:val="ListBullet"/>
+      </w:pPr>
+      <w:r>
+        <w:rPr>
+          <w:b/>
+        </w:rPr>
+        <w:t>feat:</w:t>
+      </w:r>
+      <w:r>
+        <w:t xml:space="preserve"> New feature or functionality</w:t>
+      </w:r>
+    </w:p>
+    <w:p>
+      <w:pPr>
+        <w:pStyle w:val="ListBullet"/>
+      </w:pPr>
+      <w:r>
+        <w:rPr>
+          <w:b/>
+        </w:rPr>
+        <w:t>fix:</w:t>
+      </w:r>
+      <w:r>
+        <w:t xml:space="preserve"> Bug fix</w:t>
+      </w:r>
+    </w:p>
+    <w:p>
+      <w:pPr>
+        <w:pStyle w:val="ListBullet"/>
+      </w:pPr>
+      <w:r>
+        <w:rPr>
+          <w:b/>
+        </w:rPr>
+        <w:t>refactor:</w:t>
+      </w:r>
+      <w:r>
+        <w:t xml:space="preserve"> Code restructuring (no feature/bug change)</w:t>
+      </w:r>
+    </w:p>
+    <w:p>
+      <w:pPr>
+        <w:pStyle w:val="ListBullet"/>
+      </w:pPr>
+      <w:r>
+        <w:rPr>
+          <w:b/>
+        </w:rPr>
+        <w:t>docs:</w:t>
+      </w:r>
+      <w:r>
+        <w:t xml:space="preserve"> Documentation only</w:t>
+      </w:r>
+    </w:p>
+    <w:p>
+      <w:pPr>
+        <w:pStyle w:val="ListBullet"/>
+      </w:pPr>
+      <w:r>
+        <w:rPr>
+          <w:b/>
+        </w:rPr>
+        <w:t>test:</w:t>
+      </w:r>
+      <w:r>
+        <w:t xml:space="preserve"> Adding or fixing tests</w:t>
+      </w:r>
+    </w:p>
+    <w:p>
+      <w:pPr>
+        <w:pStyle w:val="ListBullet"/>
+      </w:pPr>
+      <w:r>
+        <w:rPr>
+          <w:b/>
+        </w:rPr>
+        <w:t>chore:</w:t>
+      </w:r>
+      <w:r>
+        <w:t xml:space="preserve"> Maintenance (dependencies, config, tooling)</w:t>
+      </w:r>
+    </w:p>
+    <w:p>
+      <w:pPr>
+        <w:pStyle w:val="ListBullet"/>
+      </w:pPr>
+      <w:r>
+        <w:rPr>
+          <w:b/>
+        </w:rPr>
+        <w:t>perf:</w:t>
+      </w:r>
+      <w:r>
+        <w:t xml:space="preserve"> Performance improvement</w:t>
+      </w:r>
+    </w:p>
+    <w:p>
+      <w:pPr>
+        <w:pStyle w:val="Heading2"/>
+      </w:pPr>
+      <w:r>
+        <w:rPr>
+          <w:color w:val="37516F"/>
+        </w:rPr>
+        <w:t>8.3  Files automatically excluded from git</w:t>
+      </w:r>
+    </w:p>
+    <w:p>
+      <w:pPr>
+        <w:pStyle w:val="ListBullet"/>
+      </w:pPr>
+      <w:r>
+        <w:t>backend/.env              (secrets - NEVER committed)</w:t>
+      </w:r>
+    </w:p>
+    <w:p>
+      <w:pPr>
+        <w:pStyle w:val="ListBullet"/>
+      </w:pPr>
+      <w:r>
+        <w:t>backend/myavatar.db       (local database file)</w:t>
+      </w:r>
+    </w:p>
+    <w:p>
+      <w:pPr>
+        <w:pStyle w:val="ListBullet"/>
+      </w:pPr>
+      <w:r>
+        <w:t>backend/media/            (uploaded files)</w:t>
+      </w:r>
+    </w:p>
+    <w:p>
+      <w:pPr>
+        <w:pStyle w:val="ListBullet"/>
+      </w:pPr>
+      <w:r>
+        <w:t>backend/.venv/            (Python virtual environment)</w:t>
+      </w:r>
+    </w:p>
+    <w:p>
+      <w:pPr>
+        <w:pStyle w:val="ListBullet"/>
+      </w:pPr>
+      <w:r>
+        <w:t>frontend/node_modules/    (Node dependencies)</w:t>
+      </w:r>
+    </w:p>
+    <w:p>
+      <w:pPr>
+        <w:pStyle w:val="ListBullet"/>
+      </w:pPr>
+      <w:r>
+        <w:t>frontend/.next/           (Next.js build cache)</w:t>
+      </w:r>
+    </w:p>
+    <w:p>
+      <w:pPr>
+        <w:pStyle w:val="ListBullet"/>
+      </w:pPr>
+      <w:r>
+        <w:t>frontend/playwright-report/ and test-results/</w:t>
+      </w:r>
+    </w:p>
+    <w:p>
+      <w:pPr>
+        <w:pStyle w:val="ListBullet"/>
+      </w:pPr>
+      <w:r>
+        <w:t>All __pycache__/ directories</w:t>
+      </w:r>
+    </w:p>
+    <w:p>
+      <w:pPr>
+        <w:pStyle w:val="ListBullet"/>
+      </w:pPr>
+      <w:r>
+        <w:t>OS files: .DS_Store, Thumbs.db</w:t>
+      </w:r>
+    </w:p>
+    <w:p>
+      <w:pPr>
+        <w:pStyle w:val="ListBullet"/>
+      </w:pPr>
+      <w:r>
+        <w:t>Word temp files: ~$*.docx</w:t>
+      </w:r>
+    </w:p>
+    <w:p>
+      <w:pPr>
+        <w:ind w:left="288"/>
+        <w:shd w:val="clear" w:color="auto" w:fill="FEE2E2"/>
+      </w:pPr>
+      <w:r>
+        <w:rPr>
+          <w:sz w:val="20"/>
+        </w:rPr>
+        <w:t>IMPORTANT: Never commit .env files. They contain secret keys. Use .env.example (safe template) and .env.local.example to share config structure.</w:t>
+      </w:r>
+    </w:p>
+    <w:p/>
+    <w:p>
+      <w:pPr>
+        <w:pStyle w:val="Heading1"/>
+      </w:pPr>
+      <w:r>
+        <w:rPr>
+          <w:color w:val="1A56DB"/>
+        </w:rPr>
+        <w:t>9. Change Log</w:t>
       </w:r>
     </w:p>
     <w:tbl>
@@ -1272,6 +1557,102 @@
           <w:p>
             <w:r>
               <w:t>Axios interceptor guard, middleware.ts, useEffect redirect, worker limit -&gt; all 34 pass</w:t>
+            </w:r>
+          </w:p>
+        </w:tc>
+      </w:tr>
+      <w:tr>
+        <w:tc>
+          <w:tcPr>
+            <w:tcW w:type="dxa" w:w="2880"/>
+          </w:tcPr>
+          <w:p>
+            <w:r>
+              <w:t>2026-05-25</w:t>
+            </w:r>
+          </w:p>
+        </w:tc>
+        <w:tc>
+          <w:tcPr>
+            <w:tcW w:type="dxa" w:w="2880"/>
+          </w:tcPr>
+          <w:p>
+            <w:r>
+              <w:t>GitHub repo connected</w:t>
+            </w:r>
+          </w:p>
+        </w:tc>
+        <w:tc>
+          <w:tcPr>
+            <w:tcW w:type="dxa" w:w="2880"/>
+          </w:tcPr>
+          <w:p>
+            <w:r>
+              <w:t>103 files pushed to https://github.com/ahamedshaik52/My-Avatar (main branch)</w:t>
+            </w:r>
+          </w:p>
+        </w:tc>
+      </w:tr>
+      <w:tr>
+        <w:tc>
+          <w:tcPr>
+            <w:tcW w:type="dxa" w:w="2880"/>
+          </w:tcPr>
+          <w:p>
+            <w:r>
+              <w:t>2026-05-25</w:t>
+            </w:r>
+          </w:p>
+        </w:tc>
+        <w:tc>
+          <w:tcPr>
+            <w:tcW w:type="dxa" w:w="2880"/>
+          </w:tcPr>
+          <w:p>
+            <w:r>
+              <w:t>Added .gitignore + .gitattributes</w:t>
+            </w:r>
+          </w:p>
+        </w:tc>
+        <w:tc>
+          <w:tcPr>
+            <w:tcW w:type="dxa" w:w="2880"/>
+          </w:tcPr>
+          <w:p>
+            <w:r>
+              <w:t>Excludes .env, db, node_modules, .next, build artefacts; enforces LF line endings</w:t>
+            </w:r>
+          </w:p>
+        </w:tc>
+      </w:tr>
+      <w:tr>
+        <w:tc>
+          <w:tcPr>
+            <w:tcW w:type="dxa" w:w="2880"/>
+          </w:tcPr>
+          <w:p>
+            <w:r>
+              <w:t>2026-05-25</w:t>
+            </w:r>
+          </w:p>
+        </w:tc>
+        <w:tc>
+          <w:tcPr>
+            <w:tcW w:type="dxa" w:w="2880"/>
+          </w:tcPr>
+          <w:p>
+            <w:r>
+              <w:t>Added Git Workflow section</w:t>
+            </w:r>
+          </w:p>
+        </w:tc>
+        <w:tc>
+          <w:tcPr>
+            <w:tcW w:type="dxa" w:w="2880"/>
+          </w:tcPr>
+          <w:p>
+            <w:r>
+              <w:t>Section 8 in this guide covers commit format, push commands, and excluded files</w:t>
             </w:r>
           </w:p>
         </w:tc>

</xml_diff>

<commit_message>
docs: add production URLs section to development guide
- Added Section 8 "Production URLs (Live Deployment)" with live links for
  frontend (Vercel), backend API (Railway), Swagger docs, and GitHub repo
- Renumbered Git Workflow → Section 9 and Change Log → Section 10
- Added changelog entries for Railway and Vercel deployments
</commit_message>
<xml_diff>
--- a/DEVELOPMENT_GUIDE.docx
+++ b/DEVELOPMENT_GUIDE.docx
@@ -23,7 +23,7 @@
           <w:color w:val="6B7280"/>
           <w:sz w:val="18"/>
         </w:rPr>
-        <w:t>Last updated: 2026-05-25 09:55</w:t>
+        <w:t>Last updated: 2026-05-25 21:16</w:t>
       </w:r>
     </w:p>
     <w:p/>
@@ -1093,7 +1093,245 @@
         <w:rPr>
           <w:color w:val="1A56DB"/>
         </w:rPr>
-        <w:t>8. Git Workflow</w:t>
+        <w:t>8. Production URLs (Live Deployment)</w:t>
+      </w:r>
+    </w:p>
+    <w:p>
+      <w:pPr>
+        <w:ind w:left="288"/>
+        <w:shd w:val="clear" w:color="auto" w:fill="D1FAE5"/>
+      </w:pPr>
+      <w:r>
+        <w:rPr>
+          <w:sz w:val="20"/>
+        </w:rPr>
+        <w:t>Both services are deployed and publicly accessible. Frontend auto-deploys from GitHub (main branch) via Vercel. Backend is hosted on Railway.</w:t>
+      </w:r>
+    </w:p>
+    <w:p/>
+    <w:tbl>
+      <w:tblPr>
+        <w:tblStyle w:val="LightList-Accent1"/>
+        <w:tblW w:type="auto" w:w="0"/>
+        <w:tblLook w:firstColumn="1" w:firstRow="1" w:lastColumn="0" w:lastRow="0" w:noHBand="0" w:noVBand="1" w:val="04A0"/>
+      </w:tblPr>
+      <w:tblGrid>
+        <w:gridCol w:w="2880"/>
+        <w:gridCol w:w="2880"/>
+        <w:gridCol w:w="2880"/>
+      </w:tblGrid>
+      <w:tr>
+        <w:tc>
+          <w:tcPr>
+            <w:tcW w:type="dxa" w:w="2880"/>
+          </w:tcPr>
+          <w:p>
+            <w:r>
+              <w:rPr>
+                <w:b/>
+              </w:rPr>
+              <w:t>Service</w:t>
+            </w:r>
+          </w:p>
+        </w:tc>
+        <w:tc>
+          <w:tcPr>
+            <w:tcW w:type="dxa" w:w="2880"/>
+          </w:tcPr>
+          <w:p>
+            <w:r>
+              <w:rPr>
+                <w:b/>
+              </w:rPr>
+              <w:t>URL</w:t>
+            </w:r>
+          </w:p>
+        </w:tc>
+        <w:tc>
+          <w:tcPr>
+            <w:tcW w:type="dxa" w:w="2880"/>
+          </w:tcPr>
+          <w:p>
+            <w:r>
+              <w:rPr>
+                <w:b/>
+              </w:rPr>
+              <w:t>Platform</w:t>
+            </w:r>
+          </w:p>
+        </w:tc>
+      </w:tr>
+      <w:tr>
+        <w:tc>
+          <w:tcPr>
+            <w:tcW w:type="dxa" w:w="2880"/>
+          </w:tcPr>
+          <w:p>
+            <w:r>
+              <w:t>Frontend (Next.js)</w:t>
+            </w:r>
+          </w:p>
+        </w:tc>
+        <w:tc>
+          <w:tcPr>
+            <w:tcW w:type="dxa" w:w="2880"/>
+          </w:tcPr>
+          <w:p>
+            <w:r>
+              <w:t>https://my-avatar-smoky.vercel.app</w:t>
+            </w:r>
+          </w:p>
+        </w:tc>
+        <w:tc>
+          <w:tcPr>
+            <w:tcW w:type="dxa" w:w="2880"/>
+          </w:tcPr>
+          <w:p>
+            <w:r>
+              <w:t>Vercel (Hobby)</w:t>
+            </w:r>
+          </w:p>
+        </w:tc>
+      </w:tr>
+      <w:tr>
+        <w:tc>
+          <w:tcPr>
+            <w:tcW w:type="dxa" w:w="2880"/>
+          </w:tcPr>
+          <w:p>
+            <w:r>
+              <w:t>Backend API (FastAPI)</w:t>
+            </w:r>
+          </w:p>
+        </w:tc>
+        <w:tc>
+          <w:tcPr>
+            <w:tcW w:type="dxa" w:w="2880"/>
+          </w:tcPr>
+          <w:p>
+            <w:r>
+              <w:t>https://my-avatar-production.up.railway.app</w:t>
+            </w:r>
+          </w:p>
+        </w:tc>
+        <w:tc>
+          <w:tcPr>
+            <w:tcW w:type="dxa" w:w="2880"/>
+          </w:tcPr>
+          <w:p>
+            <w:r>
+              <w:t>Railway</w:t>
+            </w:r>
+          </w:p>
+        </w:tc>
+      </w:tr>
+      <w:tr>
+        <w:tc>
+          <w:tcPr>
+            <w:tcW w:type="dxa" w:w="2880"/>
+          </w:tcPr>
+          <w:p>
+            <w:r>
+              <w:t>API Health Check</w:t>
+            </w:r>
+          </w:p>
+        </w:tc>
+        <w:tc>
+          <w:tcPr>
+            <w:tcW w:type="dxa" w:w="2880"/>
+          </w:tcPr>
+          <w:p>
+            <w:r>
+              <w:t>https://my-avatar-production.up.railway.app/api/health</w:t>
+            </w:r>
+          </w:p>
+        </w:tc>
+        <w:tc>
+          <w:tcPr>
+            <w:tcW w:type="dxa" w:w="2880"/>
+          </w:tcPr>
+          <w:p>
+            <w:r>
+              <w:t>Railway</w:t>
+            </w:r>
+          </w:p>
+        </w:tc>
+      </w:tr>
+      <w:tr>
+        <w:tc>
+          <w:tcPr>
+            <w:tcW w:type="dxa" w:w="2880"/>
+          </w:tcPr>
+          <w:p>
+            <w:r>
+              <w:t>API Swagger Docs</w:t>
+            </w:r>
+          </w:p>
+        </w:tc>
+        <w:tc>
+          <w:tcPr>
+            <w:tcW w:type="dxa" w:w="2880"/>
+          </w:tcPr>
+          <w:p>
+            <w:r>
+              <w:t>https://my-avatar-production.up.railway.app/api/docs</w:t>
+            </w:r>
+          </w:p>
+        </w:tc>
+        <w:tc>
+          <w:tcPr>
+            <w:tcW w:type="dxa" w:w="2880"/>
+          </w:tcPr>
+          <w:p>
+            <w:r>
+              <w:t>Railway</w:t>
+            </w:r>
+          </w:p>
+        </w:tc>
+      </w:tr>
+      <w:tr>
+        <w:tc>
+          <w:tcPr>
+            <w:tcW w:type="dxa" w:w="2880"/>
+          </w:tcPr>
+          <w:p>
+            <w:r>
+              <w:t>GitHub Repository</w:t>
+            </w:r>
+          </w:p>
+        </w:tc>
+        <w:tc>
+          <w:tcPr>
+            <w:tcW w:type="dxa" w:w="2880"/>
+          </w:tcPr>
+          <w:p>
+            <w:r>
+              <w:t>https://github.com/ahamedshaik52/My-Avatar</w:t>
+            </w:r>
+          </w:p>
+        </w:tc>
+        <w:tc>
+          <w:tcPr>
+            <w:tcW w:type="dxa" w:w="2880"/>
+          </w:tcPr>
+          <w:p>
+            <w:r>
+              <w:t>GitHub</w:t>
+            </w:r>
+          </w:p>
+        </w:tc>
+      </w:tr>
+    </w:tbl>
+    <w:p/>
+    <w:p>
+      <w:pPr>
+        <w:pStyle w:val="Heading1"/>
+      </w:pPr>
+      <w:r>
+        <w:rPr>
+          <w:color w:val="1A56DB"/>
+        </w:rPr>
+        <w:t>9. Git Workflow</w:t>
       </w:r>
     </w:p>
     <w:p>
@@ -1109,7 +1347,7 @@
         <w:rPr>
           <w:color w:val="37516F"/>
         </w:rPr>
-        <w:t>8.1  Pushing changes after editing files</w:t>
+        <w:t>9.1  Pushing changes after editing files</w:t>
       </w:r>
     </w:p>
     <w:p>
@@ -1160,7 +1398,7 @@
         <w:rPr>
           <w:color w:val="37516F"/>
         </w:rPr>
-        <w:t>8.2  Commit message format</w:t>
+        <w:t>9.2  Commit message format</w:t>
       </w:r>
     </w:p>
     <w:p>
@@ -1274,7 +1512,7 @@
         <w:rPr>
           <w:color w:val="37516F"/>
         </w:rPr>
-        <w:t>8.3  Files automatically excluded from git</w:t>
+        <w:t>9.3  Files automatically excluded from git</w:t>
       </w:r>
     </w:p>
     <w:p>
@@ -1378,7 +1616,7 @@
         <w:rPr>
           <w:color w:val="1A56DB"/>
         </w:rPr>
-        <w:t>9. Change Log</w:t>
+        <w:t>10. Change Log</w:t>
       </w:r>
     </w:p>
     <w:tbl>
@@ -1652,7 +1890,71 @@
           </w:tcPr>
           <w:p>
             <w:r>
-              <w:t>Section 8 in this guide covers commit format, push commands, and excluded files</w:t>
+              <w:t>Section 9 in this guide covers commit format, push commands, and excluded files</w:t>
+            </w:r>
+          </w:p>
+        </w:tc>
+      </w:tr>
+      <w:tr>
+        <w:tc>
+          <w:tcPr>
+            <w:tcW w:type="dxa" w:w="2880"/>
+          </w:tcPr>
+          <w:p>
+            <w:r>
+              <w:t>2026-05-25</w:t>
+            </w:r>
+          </w:p>
+        </w:tc>
+        <w:tc>
+          <w:tcPr>
+            <w:tcW w:type="dxa" w:w="2880"/>
+          </w:tcPr>
+          <w:p>
+            <w:r>
+              <w:t>Backend deployed to Railway</w:t>
+            </w:r>
+          </w:p>
+        </w:tc>
+        <w:tc>
+          <w:tcPr>
+            <w:tcW w:type="dxa" w:w="2880"/>
+          </w:tcPr>
+          <w:p>
+            <w:r>
+              <w:t>FastAPI + Postgres + Redis live at https://my-avatar-production.up.railway.app</w:t>
+            </w:r>
+          </w:p>
+        </w:tc>
+      </w:tr>
+      <w:tr>
+        <w:tc>
+          <w:tcPr>
+            <w:tcW w:type="dxa" w:w="2880"/>
+          </w:tcPr>
+          <w:p>
+            <w:r>
+              <w:t>2026-05-25</w:t>
+            </w:r>
+          </w:p>
+        </w:tc>
+        <w:tc>
+          <w:tcPr>
+            <w:tcW w:type="dxa" w:w="2880"/>
+          </w:tcPr>
+          <w:p>
+            <w:r>
+              <w:t>Frontend deployed to Vercel</w:t>
+            </w:r>
+          </w:p>
+        </w:tc>
+        <w:tc>
+          <w:tcPr>
+            <w:tcW w:type="dxa" w:w="2880"/>
+          </w:tcPr>
+          <w:p>
+            <w:r>
+              <w:t>Next.js app live at https://my-avatar-smoky.vercel.app (auto-deploys from GitHub main)</w:t>
             </w:r>
           </w:p>
         </w:tc>

</xml_diff>